<commit_message>
correcciones estaciones1,2,3 y procesamiento
</commit_message>
<xml_diff>
--- a/doc/Entregable1_Ruben_Sahuquillo_Redondo.docx
+++ b/doc/Entregable1_Ruben_Sahuquillo_Redondo.docx
@@ -1109,61 +1109,19 @@
         <w:rPr>
           <w:lang w:val="es-ES"/>
         </w:rPr>
-        <w:t xml:space="preserve"> se mostrará el esquema empleado para el desarrollo y estructuración del proyecto, seguido de la implementación en código de </w:t>
-      </w:r>
-      <w:r>
-        <w:rPr>
-          <w:lang w:val="es-ES"/>
-        </w:rPr>
-        <w:t xml:space="preserve">2 de las </w:t>
-      </w:r>
-      <w:r>
-        <w:rPr>
-          <w:lang w:val="es-ES"/>
-        </w:rPr>
-        <w:t xml:space="preserve">3 opciones </w:t>
-      </w:r>
-      <w:r>
-        <w:rPr>
-          <w:lang w:val="es-ES"/>
-        </w:rPr>
-        <w:t>planteadas en la práctica</w:t>
-      </w:r>
-      <w:r>
-        <w:rPr>
-          <w:lang w:val="es-ES"/>
-        </w:rPr>
-        <w:t xml:space="preserve"> (</w:t>
-      </w:r>
-      <w:r>
-        <w:rPr>
-          <w:lang w:val="es-ES"/>
-        </w:rPr>
-        <w:t>básica</w:t>
-      </w:r>
-      <w:r>
-        <w:rPr>
-          <w:lang w:val="es-ES"/>
-        </w:rPr>
-        <w:t xml:space="preserve"> y</w:t>
-      </w:r>
-      <w:r>
-        <w:rPr>
-          <w:lang w:val="es-ES"/>
-        </w:rPr>
-        <w:t xml:space="preserve"> avanzada</w:t>
-      </w:r>
-      <w:r>
-        <w:rPr>
-          <w:lang w:val="es-ES"/>
-        </w:rPr>
-        <w:t xml:space="preserve"> I)</w:t>
-      </w:r>
-      <w:r>
-        <w:rPr>
-          <w:lang w:val="es-ES"/>
-        </w:rPr>
-        <w:t>, no habiendo implementado la parte avanzada II</w:t>
+        <w:t xml:space="preserve"> se mostrará el esquema empleado para el desarrollo y estructuración del proyecto, seguido de la implementación en código </w:t>
+      </w:r>
+      <w:r>
+        <w:rPr>
+          <w:lang w:val="es-ES"/>
+        </w:rPr>
+        <w:t>hasta la fase avanzada I,</w:t>
+      </w:r>
+      <w:r>
+        <w:rPr>
+          <w:lang w:val="es-ES"/>
+        </w:rPr>
+        <w:t xml:space="preserve"> no habiendo implementado la parte avanzada II</w:t>
       </w:r>
       <w:r>
         <w:rPr>
@@ -2333,22 +2291,6 @@
     </w:p>
     <w:p>
       <w:pPr>
-        <w:pStyle w:val="Ttulo2"/>
-        <w:rPr>
-          <w:lang w:val="es-ES"/>
-        </w:rPr>
-      </w:pPr>
-      <w:bookmarkStart w:id="6" w:name="_Toc228499823"/>
-      <w:r>
-        <w:rPr>
-          <w:lang w:val="es-ES"/>
-        </w:rPr>
-        <w:t>5.1. Opción básica</w:t>
-      </w:r>
-      <w:bookmarkEnd w:id="6"/>
-    </w:p>
-    <w:p>
-      <w:pPr>
         <w:rPr>
           <w:b/>
           <w:bCs/>
@@ -2412,19 +2354,22 @@
       <w:pPr>
         <w:jc w:val="center"/>
         <w:rPr>
-          <w:lang w:val="es-ES"/>
-        </w:rPr>
-      </w:pPr>
-      <w:r>
-        <w:rPr>
-          <w:noProof/>
+          <w:b/>
+          <w:bCs/>
+          <w:lang w:val="es-ES"/>
+        </w:rPr>
+      </w:pPr>
+      <w:r>
+        <w:rPr>
+          <w:b/>
+          <w:bCs/>
           <w:lang w:val="es-ES"/>
         </w:rPr>
         <w:drawing>
-          <wp:inline distT="0" distB="0" distL="0" distR="0" wp14:anchorId="5474DC23" wp14:editId="222E1EDB">
-            <wp:extent cx="2019582" cy="6182588"/>
-            <wp:effectExtent l="0" t="0" r="0" b="8890"/>
-            <wp:docPr id="482523921" name="Imagen 1"/>
+          <wp:inline distT="0" distB="0" distL="0" distR="0" wp14:anchorId="10179422" wp14:editId="739A9824">
+            <wp:extent cx="2010056" cy="7306695"/>
+            <wp:effectExtent l="0" t="0" r="9525" b="0"/>
+            <wp:docPr id="1714179667" name="Imagen 1"/>
             <wp:cNvGraphicFramePr>
               <a:graphicFrameLocks xmlns:a="http://schemas.openxmlformats.org/drawingml/2006/main" noChangeAspect="1"/>
             </wp:cNvGraphicFramePr>
@@ -2432,7 +2377,7 @@
               <a:graphicData uri="http://schemas.openxmlformats.org/drawingml/2006/picture">
                 <pic:pic xmlns:pic="http://schemas.openxmlformats.org/drawingml/2006/picture">
                   <pic:nvPicPr>
-                    <pic:cNvPr id="482523921" name=""/>
+                    <pic:cNvPr id="1714179667" name=""/>
                     <pic:cNvPicPr/>
                   </pic:nvPicPr>
                   <pic:blipFill>
@@ -2444,7 +2389,7 @@
                   <pic:spPr>
                     <a:xfrm>
                       <a:off x="0" y="0"/>
-                      <a:ext cx="2019582" cy="6182588"/>
+                      <a:ext cx="2010056" cy="7306695"/>
                     </a:xfrm>
                     <a:prstGeom prst="rect">
                       <a:avLst/>
@@ -2460,23 +2405,19 @@
     <w:p>
       <w:pPr>
         <w:rPr>
-          <w:lang w:val="es-ES"/>
-        </w:rPr>
-      </w:pPr>
-    </w:p>
-    <w:p>
-      <w:pPr>
-        <w:rPr>
-          <w:lang w:val="es-ES"/>
-        </w:rPr>
-      </w:pPr>
-    </w:p>
-    <w:p>
-      <w:pPr>
-        <w:rPr>
-          <w:lang w:val="es-ES"/>
-        </w:rPr>
-      </w:pPr>
+          <w:b/>
+          <w:bCs/>
+          <w:lang w:val="es-ES"/>
+        </w:rPr>
+      </w:pPr>
+      <w:r>
+        <w:rPr>
+          <w:b/>
+          <w:bCs/>
+          <w:lang w:val="es-ES"/>
+        </w:rPr>
+        <w:br w:type="page"/>
+      </w:r>
     </w:p>
     <w:p>
       <w:pPr>
@@ -2503,21 +2444,25 @@
     </w:p>
     <w:p>
       <w:pPr>
+        <w:ind w:left="360"/>
         <w:jc w:val="center"/>
         <w:rPr>
-          <w:lang w:val="es-ES"/>
-        </w:rPr>
-      </w:pPr>
-      <w:r>
-        <w:rPr>
-          <w:noProof/>
+          <w:b/>
+          <w:bCs/>
+          <w:lang w:val="es-ES"/>
+        </w:rPr>
+      </w:pPr>
+      <w:r>
+        <w:rPr>
+          <w:b/>
+          <w:bCs/>
           <w:lang w:val="es-ES"/>
         </w:rPr>
         <w:drawing>
-          <wp:inline distT="0" distB="0" distL="0" distR="0" wp14:anchorId="37622A1D" wp14:editId="148D9BD3">
-            <wp:extent cx="5400040" cy="6370320"/>
-            <wp:effectExtent l="0" t="0" r="0" b="0"/>
-            <wp:docPr id="851309685" name="Imagen 1"/>
+          <wp:inline distT="0" distB="0" distL="0" distR="0" wp14:anchorId="4FB80DC2" wp14:editId="756BF201">
+            <wp:extent cx="5400040" cy="6360160"/>
+            <wp:effectExtent l="0" t="0" r="0" b="2540"/>
+            <wp:docPr id="2138971994" name="Imagen 1"/>
             <wp:cNvGraphicFramePr>
               <a:graphicFrameLocks xmlns:a="http://schemas.openxmlformats.org/drawingml/2006/main" noChangeAspect="1"/>
             </wp:cNvGraphicFramePr>
@@ -2525,7 +2470,7 @@
               <a:graphicData uri="http://schemas.openxmlformats.org/drawingml/2006/picture">
                 <pic:pic xmlns:pic="http://schemas.openxmlformats.org/drawingml/2006/picture">
                   <pic:nvPicPr>
-                    <pic:cNvPr id="851309685" name=""/>
+                    <pic:cNvPr id="2138971994" name=""/>
                     <pic:cNvPicPr/>
                   </pic:nvPicPr>
                   <pic:blipFill>
@@ -2537,7 +2482,7 @@
                   <pic:spPr>
                     <a:xfrm>
                       <a:off x="0" y="0"/>
-                      <a:ext cx="5400040" cy="6370320"/>
+                      <a:ext cx="5400040" cy="6360160"/>
                     </a:xfrm>
                     <a:prstGeom prst="rect">
                       <a:avLst/>
@@ -2553,44 +2498,19 @@
     <w:p>
       <w:pPr>
         <w:rPr>
-          <w:lang w:val="es-ES"/>
-        </w:rPr>
-      </w:pPr>
-    </w:p>
-    <w:p>
-      <w:pPr>
-        <w:rPr>
-          <w:lang w:val="es-ES"/>
-        </w:rPr>
-      </w:pPr>
-    </w:p>
-    <w:p>
-      <w:pPr>
-        <w:rPr>
-          <w:lang w:val="es-ES"/>
-        </w:rPr>
-      </w:pPr>
-    </w:p>
-    <w:p>
-      <w:pPr>
-        <w:rPr>
-          <w:lang w:val="es-ES"/>
-        </w:rPr>
-      </w:pPr>
-    </w:p>
-    <w:p>
-      <w:pPr>
-        <w:rPr>
-          <w:lang w:val="es-ES"/>
-        </w:rPr>
-      </w:pPr>
-    </w:p>
-    <w:p>
-      <w:pPr>
-        <w:rPr>
-          <w:lang w:val="es-ES"/>
-        </w:rPr>
-      </w:pPr>
+          <w:b/>
+          <w:bCs/>
+          <w:lang w:val="es-ES"/>
+        </w:rPr>
+      </w:pPr>
+      <w:r>
+        <w:rPr>
+          <w:b/>
+          <w:bCs/>
+          <w:lang w:val="es-ES"/>
+        </w:rPr>
+        <w:br w:type="page"/>
+      </w:r>
     </w:p>
     <w:p>
       <w:pPr>
@@ -2600,11 +2520,15 @@
           <w:numId w:val="2"/>
         </w:numPr>
         <w:rPr>
-          <w:lang w:val="es-ES"/>
-        </w:rPr>
-      </w:pPr>
-      <w:r>
-        <w:rPr>
+          <w:b/>
+          <w:bCs/>
+          <w:lang w:val="es-ES"/>
+        </w:rPr>
+      </w:pPr>
+      <w:r>
+        <w:rPr>
+          <w:b/>
+          <w:bCs/>
           <w:lang w:val="es-ES"/>
         </w:rPr>
         <w:lastRenderedPageBreak/>
@@ -2615,19 +2539,22 @@
       <w:pPr>
         <w:jc w:val="center"/>
         <w:rPr>
-          <w:lang w:val="es-ES"/>
-        </w:rPr>
-      </w:pPr>
-      <w:r>
-        <w:rPr>
-          <w:noProof/>
+          <w:b/>
+          <w:bCs/>
+          <w:lang w:val="es-ES"/>
+        </w:rPr>
+      </w:pPr>
+      <w:r>
+        <w:rPr>
+          <w:b/>
+          <w:bCs/>
           <w:lang w:val="es-ES"/>
         </w:rPr>
         <w:drawing>
-          <wp:inline distT="0" distB="0" distL="0" distR="0" wp14:anchorId="689ED63F" wp14:editId="19E72067">
-            <wp:extent cx="5400040" cy="7044690"/>
-            <wp:effectExtent l="0" t="0" r="0" b="3810"/>
-            <wp:docPr id="143853049" name="Imagen 1"/>
+          <wp:inline distT="0" distB="0" distL="0" distR="0" wp14:anchorId="1E666B62" wp14:editId="61990FF4">
+            <wp:extent cx="5400040" cy="7063105"/>
+            <wp:effectExtent l="0" t="0" r="0" b="4445"/>
+            <wp:docPr id="1042742339" name="Imagen 1"/>
             <wp:cNvGraphicFramePr>
               <a:graphicFrameLocks xmlns:a="http://schemas.openxmlformats.org/drawingml/2006/main" noChangeAspect="1"/>
             </wp:cNvGraphicFramePr>
@@ -2635,7 +2562,7 @@
               <a:graphicData uri="http://schemas.openxmlformats.org/drawingml/2006/picture">
                 <pic:pic xmlns:pic="http://schemas.openxmlformats.org/drawingml/2006/picture">
                   <pic:nvPicPr>
-                    <pic:cNvPr id="143853049" name=""/>
+                    <pic:cNvPr id="1042742339" name=""/>
                     <pic:cNvPicPr/>
                   </pic:nvPicPr>
                   <pic:blipFill>
@@ -2647,7 +2574,7 @@
                   <pic:spPr>
                     <a:xfrm>
                       <a:off x="0" y="0"/>
-                      <a:ext cx="5400040" cy="7044690"/>
+                      <a:ext cx="5400040" cy="7063105"/>
                     </a:xfrm>
                     <a:prstGeom prst="rect">
                       <a:avLst/>
@@ -2663,30 +2590,19 @@
     <w:p>
       <w:pPr>
         <w:rPr>
-          <w:lang w:val="es-ES"/>
-        </w:rPr>
-      </w:pPr>
-    </w:p>
-    <w:p>
-      <w:pPr>
-        <w:rPr>
-          <w:lang w:val="es-ES"/>
-        </w:rPr>
-      </w:pPr>
-    </w:p>
-    <w:p>
-      <w:pPr>
-        <w:rPr>
-          <w:lang w:val="es-ES"/>
-        </w:rPr>
-      </w:pPr>
-    </w:p>
-    <w:p>
-      <w:pPr>
-        <w:rPr>
-          <w:lang w:val="es-ES"/>
-        </w:rPr>
-      </w:pPr>
+          <w:b/>
+          <w:bCs/>
+          <w:lang w:val="es-ES"/>
+        </w:rPr>
+      </w:pPr>
+      <w:r>
+        <w:rPr>
+          <w:b/>
+          <w:bCs/>
+          <w:lang w:val="es-ES"/>
+        </w:rPr>
+        <w:br w:type="page"/>
+      </w:r>
     </w:p>
     <w:p>
       <w:pPr>
@@ -2696,11 +2612,15 @@
           <w:numId w:val="2"/>
         </w:numPr>
         <w:rPr>
-          <w:lang w:val="es-ES"/>
-        </w:rPr>
-      </w:pPr>
-      <w:r>
-        <w:rPr>
+          <w:b/>
+          <w:bCs/>
+          <w:lang w:val="es-ES"/>
+        </w:rPr>
+      </w:pPr>
+      <w:r>
+        <w:rPr>
+          <w:b/>
+          <w:bCs/>
           <w:lang w:val="es-ES"/>
         </w:rPr>
         <w:lastRenderedPageBreak/>
@@ -2711,19 +2631,22 @@
       <w:pPr>
         <w:jc w:val="center"/>
         <w:rPr>
-          <w:lang w:val="es-ES"/>
-        </w:rPr>
-      </w:pPr>
-      <w:r>
-        <w:rPr>
-          <w:noProof/>
+          <w:b/>
+          <w:bCs/>
+          <w:lang w:val="es-ES"/>
+        </w:rPr>
+      </w:pPr>
+      <w:r>
+        <w:rPr>
+          <w:b/>
+          <w:bCs/>
           <w:lang w:val="es-ES"/>
         </w:rPr>
         <w:drawing>
-          <wp:inline distT="0" distB="0" distL="0" distR="0" wp14:anchorId="192DBEB4" wp14:editId="625FCD13">
-            <wp:extent cx="5400040" cy="7331710"/>
-            <wp:effectExtent l="0" t="0" r="0" b="2540"/>
-            <wp:docPr id="180920316" name="Imagen 1"/>
+          <wp:inline distT="0" distB="0" distL="0" distR="0" wp14:anchorId="77DEDFFF" wp14:editId="33D76B51">
+            <wp:extent cx="5400040" cy="5393690"/>
+            <wp:effectExtent l="0" t="0" r="0" b="0"/>
+            <wp:docPr id="268416736" name="Imagen 1"/>
             <wp:cNvGraphicFramePr>
               <a:graphicFrameLocks xmlns:a="http://schemas.openxmlformats.org/drawingml/2006/main" noChangeAspect="1"/>
             </wp:cNvGraphicFramePr>
@@ -2731,7 +2654,7 @@
               <a:graphicData uri="http://schemas.openxmlformats.org/drawingml/2006/picture">
                 <pic:pic xmlns:pic="http://schemas.openxmlformats.org/drawingml/2006/picture">
                   <pic:nvPicPr>
-                    <pic:cNvPr id="180920316" name=""/>
+                    <pic:cNvPr id="268416736" name=""/>
                     <pic:cNvPicPr/>
                   </pic:nvPicPr>
                   <pic:blipFill>
@@ -2743,7 +2666,7 @@
                   <pic:spPr>
                     <a:xfrm>
                       <a:off x="0" y="0"/>
-                      <a:ext cx="5400040" cy="7331710"/>
+                      <a:ext cx="5400040" cy="5393690"/>
                     </a:xfrm>
                     <a:prstGeom prst="rect">
                       <a:avLst/>
@@ -2759,23 +2682,19 @@
     <w:p>
       <w:pPr>
         <w:rPr>
-          <w:lang w:val="es-ES"/>
-        </w:rPr>
-      </w:pPr>
-    </w:p>
-    <w:p>
-      <w:pPr>
-        <w:rPr>
-          <w:lang w:val="es-ES"/>
-        </w:rPr>
-      </w:pPr>
-    </w:p>
-    <w:p>
-      <w:pPr>
-        <w:rPr>
-          <w:lang w:val="es-ES"/>
-        </w:rPr>
-      </w:pPr>
+          <w:b/>
+          <w:bCs/>
+          <w:lang w:val="es-ES"/>
+        </w:rPr>
+      </w:pPr>
+      <w:r>
+        <w:rPr>
+          <w:b/>
+          <w:bCs/>
+          <w:lang w:val="es-ES"/>
+        </w:rPr>
+        <w:br w:type="page"/>
+      </w:r>
     </w:p>
     <w:p>
       <w:pPr>
@@ -2785,34 +2704,41 @@
           <w:numId w:val="2"/>
         </w:numPr>
         <w:rPr>
-          <w:lang w:val="es-ES"/>
-        </w:rPr>
-      </w:pPr>
-      <w:r>
-        <w:rPr>
+          <w:b/>
+          <w:bCs/>
+          <w:lang w:val="es-ES"/>
+        </w:rPr>
+      </w:pPr>
+      <w:r>
+        <w:rPr>
+          <w:b/>
+          <w:bCs/>
           <w:lang w:val="es-ES"/>
         </w:rPr>
         <w:lastRenderedPageBreak/>
-        <w:t>Tarea de panel de estado</w:t>
+        <w:t>Tarea de cada estación</w:t>
       </w:r>
     </w:p>
     <w:p>
       <w:pPr>
         <w:jc w:val="center"/>
         <w:rPr>
-          <w:lang w:val="es-ES"/>
-        </w:rPr>
-      </w:pPr>
-      <w:r>
-        <w:rPr>
-          <w:noProof/>
+          <w:b/>
+          <w:bCs/>
+          <w:lang w:val="es-ES"/>
+        </w:rPr>
+      </w:pPr>
+      <w:r>
+        <w:rPr>
+          <w:b/>
+          <w:bCs/>
           <w:lang w:val="es-ES"/>
         </w:rPr>
         <w:drawing>
-          <wp:inline distT="0" distB="0" distL="0" distR="0" wp14:anchorId="503AAD0B" wp14:editId="760D5B88">
-            <wp:extent cx="3505689" cy="4972744"/>
-            <wp:effectExtent l="0" t="0" r="0" b="0"/>
-            <wp:docPr id="817527057" name="Imagen 1"/>
+          <wp:inline distT="0" distB="0" distL="0" distR="0" wp14:anchorId="433B66A1" wp14:editId="5346EB83">
+            <wp:extent cx="5400040" cy="7099300"/>
+            <wp:effectExtent l="0" t="0" r="0" b="6350"/>
+            <wp:docPr id="1529655567" name="Imagen 1"/>
             <wp:cNvGraphicFramePr>
               <a:graphicFrameLocks xmlns:a="http://schemas.openxmlformats.org/drawingml/2006/main" noChangeAspect="1"/>
             </wp:cNvGraphicFramePr>
@@ -2820,7 +2746,7 @@
               <a:graphicData uri="http://schemas.openxmlformats.org/drawingml/2006/picture">
                 <pic:pic xmlns:pic="http://schemas.openxmlformats.org/drawingml/2006/picture">
                   <pic:nvPicPr>
-                    <pic:cNvPr id="817527057" name=""/>
+                    <pic:cNvPr id="1529655567" name=""/>
                     <pic:cNvPicPr/>
                   </pic:nvPicPr>
                   <pic:blipFill>
@@ -2832,7 +2758,7 @@
                   <pic:spPr>
                     <a:xfrm>
                       <a:off x="0" y="0"/>
-                      <a:ext cx="3505689" cy="4972744"/>
+                      <a:ext cx="5400040" cy="7099300"/>
                     </a:xfrm>
                     <a:prstGeom prst="rect">
                       <a:avLst/>
@@ -2848,44 +2774,8 @@
     <w:p>
       <w:pPr>
         <w:rPr>
-          <w:rFonts w:asciiTheme="majorHAnsi" w:eastAsiaTheme="majorEastAsia" w:hAnsiTheme="majorHAnsi" w:cstheme="majorBidi"/>
-          <w:color w:val="0F4761" w:themeColor="accent1" w:themeShade="BF"/>
-          <w:sz w:val="32"/>
-          <w:szCs w:val="32"/>
-          <w:lang w:val="es-ES"/>
-        </w:rPr>
-      </w:pPr>
-      <w:r>
-        <w:rPr>
-          <w:lang w:val="es-ES"/>
-        </w:rPr>
-        <w:br w:type="page"/>
-      </w:r>
-    </w:p>
-    <w:p>
-      <w:pPr>
-        <w:pStyle w:val="Ttulo2"/>
-        <w:rPr>
-          <w:lang w:val="es-ES"/>
-        </w:rPr>
-      </w:pPr>
-      <w:bookmarkStart w:id="7" w:name="_Toc228499824"/>
-      <w:r>
-        <w:rPr>
-          <w:lang w:val="es-ES"/>
-        </w:rPr>
-        <w:lastRenderedPageBreak/>
-        <w:t>5.2. Opción avanzada I</w:t>
-      </w:r>
-      <w:bookmarkEnd w:id="7"/>
-    </w:p>
-    <w:p>
-      <w:pPr>
-        <w:rPr>
           <w:b/>
           <w:bCs/>
-          <w:sz w:val="28"/>
-          <w:szCs w:val="28"/>
           <w:lang w:val="es-ES"/>
         </w:rPr>
       </w:pPr>
@@ -2893,11 +2783,9 @@
         <w:rPr>
           <w:b/>
           <w:bCs/>
-          <w:sz w:val="28"/>
-          <w:szCs w:val="28"/>
-          <w:lang w:val="es-ES"/>
-        </w:rPr>
-        <w:t>Flujograma del programa</w:t>
+          <w:lang w:val="es-ES"/>
+        </w:rPr>
+        <w:br w:type="page"/>
       </w:r>
     </w:p>
     <w:p>
@@ -2919,44 +2807,30 @@
           <w:bCs/>
           <w:lang w:val="es-ES"/>
         </w:rPr>
-        <w:t>Función principal (</w:t>
-      </w:r>
-      <w:proofErr w:type="spellStart"/>
-      <w:r>
+        <w:lastRenderedPageBreak/>
+        <w:t>Tarea de panel de estado</w:t>
+      </w:r>
+    </w:p>
+    <w:p>
+      <w:pPr>
+        <w:jc w:val="center"/>
         <w:rPr>
           <w:b/>
           <w:bCs/>
           <w:lang w:val="es-ES"/>
         </w:rPr>
-        <w:t>main</w:t>
-      </w:r>
-      <w:proofErr w:type="spellEnd"/>
+      </w:pPr>
       <w:r>
         <w:rPr>
           <w:b/>
           <w:bCs/>
           <w:lang w:val="es-ES"/>
         </w:rPr>
-        <w:t>)</w:t>
-      </w:r>
-    </w:p>
-    <w:p>
-      <w:pPr>
-        <w:jc w:val="center"/>
-        <w:rPr>
-          <w:lang w:val="es-ES"/>
-        </w:rPr>
-      </w:pPr>
-      <w:r>
-        <w:rPr>
-          <w:noProof/>
-          <w:lang w:val="es-ES"/>
-        </w:rPr>
         <w:drawing>
-          <wp:inline distT="0" distB="0" distL="0" distR="0" wp14:anchorId="39BB806B" wp14:editId="693A5A17">
-            <wp:extent cx="2019582" cy="6182588"/>
+          <wp:inline distT="0" distB="0" distL="0" distR="0" wp14:anchorId="3E739506" wp14:editId="2583FA4E">
+            <wp:extent cx="5400040" cy="6410960"/>
             <wp:effectExtent l="0" t="0" r="0" b="8890"/>
-            <wp:docPr id="16841979" name="Imagen 1"/>
+            <wp:docPr id="191615959" name="Imagen 1"/>
             <wp:cNvGraphicFramePr>
               <a:graphicFrameLocks xmlns:a="http://schemas.openxmlformats.org/drawingml/2006/main" noChangeAspect="1"/>
             </wp:cNvGraphicFramePr>
@@ -2964,328 +2838,7 @@
               <a:graphicData uri="http://schemas.openxmlformats.org/drawingml/2006/picture">
                 <pic:pic xmlns:pic="http://schemas.openxmlformats.org/drawingml/2006/picture">
                   <pic:nvPicPr>
-                    <pic:cNvPr id="482523921" name=""/>
-                    <pic:cNvPicPr/>
-                  </pic:nvPicPr>
-                  <pic:blipFill>
-                    <a:blip r:embed="rId10"/>
-                    <a:stretch>
-                      <a:fillRect/>
-                    </a:stretch>
-                  </pic:blipFill>
-                  <pic:spPr>
-                    <a:xfrm>
-                      <a:off x="0" y="0"/>
-                      <a:ext cx="2019582" cy="6182588"/>
-                    </a:xfrm>
-                    <a:prstGeom prst="rect">
-                      <a:avLst/>
-                    </a:prstGeom>
-                  </pic:spPr>
-                </pic:pic>
-              </a:graphicData>
-            </a:graphic>
-          </wp:inline>
-        </w:drawing>
-      </w:r>
-    </w:p>
-    <w:p>
-      <w:pPr>
-        <w:rPr>
-          <w:lang w:val="es-ES"/>
-        </w:rPr>
-      </w:pPr>
-    </w:p>
-    <w:p>
-      <w:pPr>
-        <w:rPr>
-          <w:lang w:val="es-ES"/>
-        </w:rPr>
-      </w:pPr>
-    </w:p>
-    <w:p>
-      <w:pPr>
-        <w:rPr>
-          <w:lang w:val="es-ES"/>
-        </w:rPr>
-      </w:pPr>
-    </w:p>
-    <w:p>
-      <w:pPr>
-        <w:rPr>
-          <w:lang w:val="es-ES"/>
-        </w:rPr>
-      </w:pPr>
-    </w:p>
-    <w:p>
-      <w:pPr>
-        <w:rPr>
-          <w:lang w:val="es-ES"/>
-        </w:rPr>
-      </w:pPr>
-    </w:p>
-    <w:p>
-      <w:pPr>
-        <w:pStyle w:val="Prrafodelista"/>
-        <w:numPr>
-          <w:ilvl w:val="0"/>
-          <w:numId w:val="2"/>
-        </w:numPr>
-        <w:rPr>
-          <w:b/>
-          <w:bCs/>
-          <w:lang w:val="es-ES"/>
-        </w:rPr>
-      </w:pPr>
-      <w:r>
-        <w:rPr>
-          <w:b/>
-          <w:bCs/>
-          <w:lang w:val="es-ES"/>
-        </w:rPr>
-        <w:lastRenderedPageBreak/>
-        <w:t>Tarea de unidad de carga</w:t>
-      </w:r>
-    </w:p>
-    <w:p>
-      <w:pPr>
-        <w:jc w:val="center"/>
-        <w:rPr>
-          <w:lang w:val="es-ES"/>
-        </w:rPr>
-      </w:pPr>
-      <w:r>
-        <w:rPr>
-          <w:noProof/>
-          <w:lang w:val="es-ES"/>
-        </w:rPr>
-        <w:drawing>
-          <wp:inline distT="0" distB="0" distL="0" distR="0" wp14:anchorId="7E9F20A8" wp14:editId="39B4DA59">
-            <wp:extent cx="5400040" cy="6370320"/>
-            <wp:effectExtent l="0" t="0" r="0" b="0"/>
-            <wp:docPr id="421759029" name="Imagen 1"/>
-            <wp:cNvGraphicFramePr>
-              <a:graphicFrameLocks xmlns:a="http://schemas.openxmlformats.org/drawingml/2006/main" noChangeAspect="1"/>
-            </wp:cNvGraphicFramePr>
-            <a:graphic xmlns:a="http://schemas.openxmlformats.org/drawingml/2006/main">
-              <a:graphicData uri="http://schemas.openxmlformats.org/drawingml/2006/picture">
-                <pic:pic xmlns:pic="http://schemas.openxmlformats.org/drawingml/2006/picture">
-                  <pic:nvPicPr>
-                    <pic:cNvPr id="851309685" name=""/>
-                    <pic:cNvPicPr/>
-                  </pic:nvPicPr>
-                  <pic:blipFill>
-                    <a:blip r:embed="rId11"/>
-                    <a:stretch>
-                      <a:fillRect/>
-                    </a:stretch>
-                  </pic:blipFill>
-                  <pic:spPr>
-                    <a:xfrm>
-                      <a:off x="0" y="0"/>
-                      <a:ext cx="5400040" cy="6370320"/>
-                    </a:xfrm>
-                    <a:prstGeom prst="rect">
-                      <a:avLst/>
-                    </a:prstGeom>
-                  </pic:spPr>
-                </pic:pic>
-              </a:graphicData>
-            </a:graphic>
-          </wp:inline>
-        </w:drawing>
-      </w:r>
-    </w:p>
-    <w:p>
-      <w:pPr>
-        <w:rPr>
-          <w:lang w:val="es-ES"/>
-        </w:rPr>
-      </w:pPr>
-    </w:p>
-    <w:p>
-      <w:pPr>
-        <w:rPr>
-          <w:lang w:val="es-ES"/>
-        </w:rPr>
-      </w:pPr>
-    </w:p>
-    <w:p>
-      <w:pPr>
-        <w:rPr>
-          <w:lang w:val="es-ES"/>
-        </w:rPr>
-      </w:pPr>
-    </w:p>
-    <w:p>
-      <w:pPr>
-        <w:rPr>
-          <w:lang w:val="es-ES"/>
-        </w:rPr>
-      </w:pPr>
-    </w:p>
-    <w:p>
-      <w:pPr>
-        <w:rPr>
-          <w:lang w:val="es-ES"/>
-        </w:rPr>
-      </w:pPr>
-    </w:p>
-    <w:p>
-      <w:pPr>
-        <w:rPr>
-          <w:lang w:val="es-ES"/>
-        </w:rPr>
-      </w:pPr>
-    </w:p>
-    <w:p>
-      <w:pPr>
-        <w:pStyle w:val="Prrafodelista"/>
-        <w:numPr>
-          <w:ilvl w:val="0"/>
-          <w:numId w:val="2"/>
-        </w:numPr>
-        <w:rPr>
-          <w:b/>
-          <w:bCs/>
-          <w:lang w:val="es-ES"/>
-        </w:rPr>
-      </w:pPr>
-      <w:r>
-        <w:rPr>
-          <w:b/>
-          <w:bCs/>
-          <w:lang w:val="es-ES"/>
-        </w:rPr>
-        <w:lastRenderedPageBreak/>
-        <w:t>Tarea de unidad de preparación</w:t>
-      </w:r>
-    </w:p>
-    <w:p>
-      <w:pPr>
-        <w:jc w:val="center"/>
-        <w:rPr>
-          <w:lang w:val="es-ES"/>
-        </w:rPr>
-      </w:pPr>
-      <w:r>
-        <w:rPr>
-          <w:noProof/>
-          <w:lang w:val="es-ES"/>
-        </w:rPr>
-        <w:drawing>
-          <wp:inline distT="0" distB="0" distL="0" distR="0" wp14:anchorId="6A2951FC" wp14:editId="4E3B1F97">
-            <wp:extent cx="5400040" cy="7044690"/>
-            <wp:effectExtent l="0" t="0" r="0" b="3810"/>
-            <wp:docPr id="1253680320" name="Imagen 1"/>
-            <wp:cNvGraphicFramePr>
-              <a:graphicFrameLocks xmlns:a="http://schemas.openxmlformats.org/drawingml/2006/main" noChangeAspect="1"/>
-            </wp:cNvGraphicFramePr>
-            <a:graphic xmlns:a="http://schemas.openxmlformats.org/drawingml/2006/main">
-              <a:graphicData uri="http://schemas.openxmlformats.org/drawingml/2006/picture">
-                <pic:pic xmlns:pic="http://schemas.openxmlformats.org/drawingml/2006/picture">
-                  <pic:nvPicPr>
-                    <pic:cNvPr id="143853049" name=""/>
-                    <pic:cNvPicPr/>
-                  </pic:nvPicPr>
-                  <pic:blipFill>
-                    <a:blip r:embed="rId12"/>
-                    <a:stretch>
-                      <a:fillRect/>
-                    </a:stretch>
-                  </pic:blipFill>
-                  <pic:spPr>
-                    <a:xfrm>
-                      <a:off x="0" y="0"/>
-                      <a:ext cx="5400040" cy="7044690"/>
-                    </a:xfrm>
-                    <a:prstGeom prst="rect">
-                      <a:avLst/>
-                    </a:prstGeom>
-                  </pic:spPr>
-                </pic:pic>
-              </a:graphicData>
-            </a:graphic>
-          </wp:inline>
-        </w:drawing>
-      </w:r>
-    </w:p>
-    <w:p>
-      <w:pPr>
-        <w:rPr>
-          <w:lang w:val="es-ES"/>
-        </w:rPr>
-      </w:pPr>
-    </w:p>
-    <w:p>
-      <w:pPr>
-        <w:rPr>
-          <w:lang w:val="es-ES"/>
-        </w:rPr>
-      </w:pPr>
-    </w:p>
-    <w:p>
-      <w:pPr>
-        <w:rPr>
-          <w:lang w:val="es-ES"/>
-        </w:rPr>
-      </w:pPr>
-    </w:p>
-    <w:p>
-      <w:pPr>
-        <w:rPr>
-          <w:lang w:val="es-ES"/>
-        </w:rPr>
-      </w:pPr>
-    </w:p>
-    <w:p>
-      <w:pPr>
-        <w:pStyle w:val="Prrafodelista"/>
-        <w:numPr>
-          <w:ilvl w:val="0"/>
-          <w:numId w:val="2"/>
-        </w:numPr>
-        <w:rPr>
-          <w:b/>
-          <w:bCs/>
-          <w:lang w:val="es-ES"/>
-        </w:rPr>
-      </w:pPr>
-      <w:r>
-        <w:rPr>
-          <w:b/>
-          <w:bCs/>
-          <w:lang w:val="es-ES"/>
-        </w:rPr>
-        <w:lastRenderedPageBreak/>
-        <w:t>Tarea de unidad de procesado</w:t>
-      </w:r>
-    </w:p>
-    <w:p>
-      <w:pPr>
-        <w:jc w:val="center"/>
-        <w:rPr>
-          <w:lang w:val="es-ES"/>
-        </w:rPr>
-      </w:pPr>
-      <w:r>
-        <w:rPr>
-          <w:noProof/>
-          <w:lang w:val="es-ES"/>
-        </w:rPr>
-        <w:drawing>
-          <wp:inline distT="0" distB="0" distL="0" distR="0" wp14:anchorId="35EED1A7" wp14:editId="73F6E8F3">
-            <wp:extent cx="5400040" cy="5886450"/>
-            <wp:effectExtent l="0" t="0" r="0" b="0"/>
-            <wp:docPr id="1150667142" name="Imagen 1"/>
-            <wp:cNvGraphicFramePr>
-              <a:graphicFrameLocks xmlns:a="http://schemas.openxmlformats.org/drawingml/2006/main" noChangeAspect="1"/>
-            </wp:cNvGraphicFramePr>
-            <a:graphic xmlns:a="http://schemas.openxmlformats.org/drawingml/2006/main">
-              <a:graphicData uri="http://schemas.openxmlformats.org/drawingml/2006/picture">
-                <pic:pic xmlns:pic="http://schemas.openxmlformats.org/drawingml/2006/picture">
-                  <pic:nvPicPr>
-                    <pic:cNvPr id="1150667142" name=""/>
+                    <pic:cNvPr id="191615959" name=""/>
                     <pic:cNvPicPr/>
                   </pic:nvPicPr>
                   <pic:blipFill>
@@ -3297,7 +2850,7 @@
                   <pic:spPr>
                     <a:xfrm>
                       <a:off x="0" y="0"/>
-                      <a:ext cx="5400040" cy="5886450"/>
+                      <a:ext cx="5400040" cy="6410960"/>
                     </a:xfrm>
                     <a:prstGeom prst="rect">
                       <a:avLst/>
@@ -3312,230 +2865,11 @@
     </w:p>
     <w:p>
       <w:pPr>
-        <w:rPr>
-          <w:lang w:val="es-ES"/>
-        </w:rPr>
-      </w:pPr>
-    </w:p>
-    <w:p>
-      <w:pPr>
-        <w:rPr>
-          <w:lang w:val="es-ES"/>
-        </w:rPr>
-      </w:pPr>
-    </w:p>
-    <w:p>
-      <w:pPr>
-        <w:rPr>
-          <w:lang w:val="es-ES"/>
-        </w:rPr>
-      </w:pPr>
-    </w:p>
-    <w:p>
-      <w:pPr>
-        <w:rPr>
-          <w:lang w:val="es-ES"/>
-        </w:rPr>
-      </w:pPr>
-    </w:p>
-    <w:p>
-      <w:pPr>
-        <w:rPr>
-          <w:lang w:val="es-ES"/>
-        </w:rPr>
-      </w:pPr>
-    </w:p>
-    <w:p>
-      <w:pPr>
-        <w:rPr>
-          <w:lang w:val="es-ES"/>
-        </w:rPr>
-      </w:pPr>
-    </w:p>
-    <w:p>
-      <w:pPr>
-        <w:rPr>
-          <w:lang w:val="es-ES"/>
-        </w:rPr>
-      </w:pPr>
-    </w:p>
-    <w:p>
-      <w:pPr>
-        <w:rPr>
-          <w:lang w:val="es-ES"/>
-        </w:rPr>
-      </w:pPr>
-    </w:p>
-    <w:p>
-      <w:pPr>
-        <w:pStyle w:val="Prrafodelista"/>
-        <w:numPr>
-          <w:ilvl w:val="0"/>
-          <w:numId w:val="2"/>
-        </w:numPr>
-        <w:rPr>
-          <w:b/>
-          <w:bCs/>
-          <w:lang w:val="es-ES"/>
-        </w:rPr>
-      </w:pPr>
-      <w:r>
-        <w:rPr>
-          <w:b/>
-          <w:bCs/>
-          <w:lang w:val="es-ES"/>
-        </w:rPr>
-        <w:lastRenderedPageBreak/>
-        <w:t>Tarea de cada estación</w:t>
-      </w:r>
-    </w:p>
-    <w:p>
-      <w:pPr>
         <w:jc w:val="center"/>
         <w:rPr>
           <w:lang w:val="es-ES"/>
         </w:rPr>
       </w:pPr>
-      <w:r>
-        <w:rPr>
-          <w:noProof/>
-          <w:lang w:val="es-ES"/>
-        </w:rPr>
-        <w:drawing>
-          <wp:inline distT="0" distB="0" distL="0" distR="0" wp14:anchorId="264FCBF0" wp14:editId="26B2B42E">
-            <wp:extent cx="5400040" cy="4822190"/>
-            <wp:effectExtent l="0" t="0" r="0" b="0"/>
-            <wp:docPr id="1430046159" name="Imagen 1"/>
-            <wp:cNvGraphicFramePr>
-              <a:graphicFrameLocks xmlns:a="http://schemas.openxmlformats.org/drawingml/2006/main" noChangeAspect="1"/>
-            </wp:cNvGraphicFramePr>
-            <a:graphic xmlns:a="http://schemas.openxmlformats.org/drawingml/2006/main">
-              <a:graphicData uri="http://schemas.openxmlformats.org/drawingml/2006/picture">
-                <pic:pic xmlns:pic="http://schemas.openxmlformats.org/drawingml/2006/picture">
-                  <pic:nvPicPr>
-                    <pic:cNvPr id="1430046159" name=""/>
-                    <pic:cNvPicPr/>
-                  </pic:nvPicPr>
-                  <pic:blipFill>
-                    <a:blip r:embed="rId16"/>
-                    <a:stretch>
-                      <a:fillRect/>
-                    </a:stretch>
-                  </pic:blipFill>
-                  <pic:spPr>
-                    <a:xfrm>
-                      <a:off x="0" y="0"/>
-                      <a:ext cx="5400040" cy="4822190"/>
-                    </a:xfrm>
-                    <a:prstGeom prst="rect">
-                      <a:avLst/>
-                    </a:prstGeom>
-                  </pic:spPr>
-                </pic:pic>
-              </a:graphicData>
-            </a:graphic>
-          </wp:inline>
-        </w:drawing>
-      </w:r>
-    </w:p>
-    <w:p>
-      <w:pPr>
-        <w:rPr>
-          <w:lang w:val="es-ES"/>
-        </w:rPr>
-      </w:pPr>
-    </w:p>
-    <w:p>
-      <w:pPr>
-        <w:rPr>
-          <w:lang w:val="es-ES"/>
-        </w:rPr>
-      </w:pPr>
-    </w:p>
-    <w:p>
-      <w:pPr>
-        <w:rPr>
-          <w:lang w:val="es-ES"/>
-        </w:rPr>
-      </w:pPr>
-      <w:r>
-        <w:rPr>
-          <w:lang w:val="es-ES"/>
-        </w:rPr>
-        <w:br w:type="page"/>
-      </w:r>
-    </w:p>
-    <w:p>
-      <w:pPr>
-        <w:pStyle w:val="Prrafodelista"/>
-        <w:numPr>
-          <w:ilvl w:val="0"/>
-          <w:numId w:val="2"/>
-        </w:numPr>
-        <w:rPr>
-          <w:b/>
-          <w:bCs/>
-          <w:lang w:val="es-ES"/>
-        </w:rPr>
-      </w:pPr>
-      <w:r>
-        <w:rPr>
-          <w:b/>
-          <w:bCs/>
-          <w:lang w:val="es-ES"/>
-        </w:rPr>
-        <w:lastRenderedPageBreak/>
-        <w:t>Tarea de panel de estado</w:t>
-      </w:r>
-    </w:p>
-    <w:p>
-      <w:pPr>
-        <w:jc w:val="center"/>
-        <w:rPr>
-          <w:lang w:val="es-ES"/>
-        </w:rPr>
-      </w:pPr>
-      <w:r>
-        <w:rPr>
-          <w:noProof/>
-          <w:lang w:val="es-ES"/>
-        </w:rPr>
-        <w:drawing>
-          <wp:inline distT="0" distB="0" distL="0" distR="0" wp14:anchorId="566770EA" wp14:editId="5963B406">
-            <wp:extent cx="3505689" cy="4972744"/>
-            <wp:effectExtent l="0" t="0" r="0" b="0"/>
-            <wp:docPr id="216310375" name="Imagen 1"/>
-            <wp:cNvGraphicFramePr>
-              <a:graphicFrameLocks xmlns:a="http://schemas.openxmlformats.org/drawingml/2006/main" noChangeAspect="1"/>
-            </wp:cNvGraphicFramePr>
-            <a:graphic xmlns:a="http://schemas.openxmlformats.org/drawingml/2006/main">
-              <a:graphicData uri="http://schemas.openxmlformats.org/drawingml/2006/picture">
-                <pic:pic xmlns:pic="http://schemas.openxmlformats.org/drawingml/2006/picture">
-                  <pic:nvPicPr>
-                    <pic:cNvPr id="817527057" name=""/>
-                    <pic:cNvPicPr/>
-                  </pic:nvPicPr>
-                  <pic:blipFill>
-                    <a:blip r:embed="rId14"/>
-                    <a:stretch>
-                      <a:fillRect/>
-                    </a:stretch>
-                  </pic:blipFill>
-                  <pic:spPr>
-                    <a:xfrm>
-                      <a:off x="0" y="0"/>
-                      <a:ext cx="3505689" cy="4972744"/>
-                    </a:xfrm>
-                    <a:prstGeom prst="rect">
-                      <a:avLst/>
-                    </a:prstGeom>
-                  </pic:spPr>
-                </pic:pic>
-              </a:graphicData>
-            </a:graphic>
-          </wp:inline>
-        </w:drawing>
-      </w:r>
     </w:p>
     <w:p>
       <w:pPr>
@@ -3561,7 +2895,7 @@
           <w:lang w:val="es-ES"/>
         </w:rPr>
       </w:pPr>
-      <w:bookmarkStart w:id="8" w:name="_Toc228499825"/>
+      <w:bookmarkStart w:id="6" w:name="_Toc228499825"/>
       <w:r>
         <w:rPr>
           <w:lang w:val="es-ES"/>
@@ -3569,7 +2903,7 @@
         <w:lastRenderedPageBreak/>
         <w:t>6. Conclusiones</w:t>
       </w:r>
-      <w:bookmarkEnd w:id="8"/>
+      <w:bookmarkEnd w:id="6"/>
     </w:p>
     <w:p>
       <w:pPr>
@@ -3609,7 +2943,19 @@
         <w:rPr>
           <w:lang w:val="es-ES"/>
         </w:rPr>
-        <w:t xml:space="preserve"> Se han implementado con éxito la Opción Básica y la Opción Avanzada I, cumpliendo con los requisitos de exclusión mutua y procesamiento concurrente solicitados en las especificaciones.</w:t>
+        <w:t xml:space="preserve"> </w:t>
+      </w:r>
+      <w:r>
+        <w:rPr>
+          <w:lang w:val="es-ES"/>
+        </w:rPr>
+        <w:t>Se ha implementado con éxito el sistema hasta la opción avanzada I</w:t>
+      </w:r>
+      <w:r>
+        <w:rPr>
+          <w:lang w:val="es-ES"/>
+        </w:rPr>
+        <w:t>, cumpliendo con los requisitos de exclusión mutua y procesamiento concurrente solicitados en las especificaciones.</w:t>
       </w:r>
     </w:p>
     <w:p>
@@ -3645,13 +2991,7 @@
         <w:rPr>
           <w:lang w:val="es-ES"/>
         </w:rPr>
-        <w:t xml:space="preserve"> El uso de </w:t>
-      </w:r>
-      <w:r>
-        <w:rPr>
-          <w:lang w:val="es-ES"/>
-        </w:rPr>
-        <w:t>colas (</w:t>
+        <w:t xml:space="preserve"> El uso de colas (</w:t>
       </w:r>
       <w:proofErr w:type="spellStart"/>
       <w:r>
@@ -3665,57 +3005,19 @@
         <w:rPr>
           <w:lang w:val="es-ES"/>
         </w:rPr>
-        <w:t>)</w:t>
-      </w:r>
-      <w:r>
-        <w:rPr>
-          <w:lang w:val="es-ES"/>
-        </w:rPr>
-        <w:t xml:space="preserve"> de </w:t>
-      </w:r>
-      <w:proofErr w:type="spellStart"/>
-      <w:r>
-        <w:rPr>
-          <w:lang w:val="es-ES"/>
-        </w:rPr>
-        <w:t>FreeRTOS</w:t>
-      </w:r>
-      <w:proofErr w:type="spellEnd"/>
-      <w:r>
-        <w:rPr>
-          <w:lang w:val="es-ES"/>
-        </w:rPr>
-        <w:t xml:space="preserve">, ha permitido garantizar </w:t>
-      </w:r>
-      <w:r>
-        <w:rPr>
-          <w:lang w:val="es-ES"/>
-        </w:rPr>
-        <w:t>el intercambio</w:t>
-      </w:r>
-      <w:r>
-        <w:rPr>
-          <w:lang w:val="es-ES"/>
-        </w:rPr>
-        <w:t xml:space="preserve"> de los datos entre las diferentes unidades</w:t>
-      </w:r>
-      <w:r>
-        <w:rPr>
-          <w:lang w:val="es-ES"/>
-        </w:rPr>
-        <w:t xml:space="preserve"> que conforman el proceso, así como</w:t>
-      </w:r>
-      <w:r>
-        <w:rPr>
-          <w:lang w:val="es-ES"/>
-        </w:rPr>
-        <w:t xml:space="preserve"> el cumplimiento de las restricciones de almacenamiento</w:t>
-      </w:r>
-      <w:r>
-        <w:rPr>
-          <w:lang w:val="es-ES"/>
-        </w:rPr>
-        <w:t xml:space="preserve"> impuestas en cada unidad</w:t>
+        <w:t>), ha permitido</w:t>
+      </w:r>
+      <w:r>
+        <w:rPr>
+          <w:lang w:val="es-ES"/>
+        </w:rPr>
+        <w:t xml:space="preserve"> </w:t>
+      </w:r>
+      <w:r>
+        <w:rPr>
+          <w:lang w:val="es-ES"/>
+        </w:rPr>
+        <w:t>el intercambio de los datos entre las diferentes unidades que conforman el proceso, así como el cumplimiento de las restricciones de almacenamiento impuestas en cada unidad</w:t>
       </w:r>
       <w:r>
         <w:rPr>
@@ -3746,54 +3048,72 @@
           <w:lang w:val="es-ES"/>
         </w:rPr>
       </w:pPr>
-      <w:proofErr w:type="spellStart"/>
       <w:r>
         <w:rPr>
           <w:b/>
           <w:bCs/>
           <w:lang w:val="es-ES"/>
         </w:rPr>
-        <w:t>Aprendizaje</w:t>
+        <w:t>Aprendizaje:</w:t>
+      </w:r>
+      <w:r>
+        <w:rPr>
+          <w:lang w:val="es-ES"/>
+        </w:rPr>
+        <w:t xml:space="preserve"> La realización de esta práctica me ha permitido comprender mejor los concetos de colas y gestión de tareas en sistemas de tiempo real, así como el manejo del entorno ESP-IDF. </w:t>
+      </w:r>
+    </w:p>
+    <w:p>
+      <w:pPr>
+        <w:jc w:val="both"/>
+        <w:rPr>
+          <w:lang w:val="es-ES"/>
+        </w:rPr>
+      </w:pPr>
+    </w:p>
+    <w:p>
+      <w:pPr>
+        <w:pStyle w:val="Ttulo1"/>
+        <w:rPr>
+          <w:lang w:val="es-ES"/>
+        </w:rPr>
+      </w:pPr>
+      <w:bookmarkStart w:id="7" w:name="_Toc228499826"/>
+      <w:r>
+        <w:rPr>
+          <w:lang w:val="es-ES"/>
+        </w:rPr>
+        <w:t>7. Anexos</w:t>
+      </w:r>
+      <w:bookmarkEnd w:id="7"/>
+    </w:p>
+    <w:p>
+      <w:pPr>
+        <w:jc w:val="both"/>
+        <w:rPr>
+          <w:lang w:val="es-ES"/>
+        </w:rPr>
+      </w:pPr>
+      <w:r>
+        <w:rPr>
+          <w:lang w:val="es-ES"/>
+        </w:rPr>
+        <w:t xml:space="preserve">Enlace al repositorio del proyecto en </w:t>
+      </w:r>
+      <w:proofErr w:type="spellStart"/>
+      <w:r>
+        <w:rPr>
+          <w:lang w:val="es-ES"/>
+        </w:rPr>
+        <w:t>github</w:t>
       </w:r>
       <w:proofErr w:type="spellEnd"/>
       <w:r>
         <w:rPr>
-          <w:b/>
-          <w:bCs/>
           <w:lang w:val="es-ES"/>
         </w:rPr>
         <w:t>:</w:t>
       </w:r>
-      <w:r>
-        <w:rPr>
-          <w:lang w:val="es-ES"/>
-        </w:rPr>
-        <w:t xml:space="preserve"> </w:t>
-      </w:r>
-      <w:r>
-        <w:rPr>
-          <w:lang w:val="es-ES"/>
-        </w:rPr>
-        <w:t>La realización de esta práctica me ha permitido comprender mejor los concetos de colas y gestión de tareas en sistemas de tiempo real, así como</w:t>
-      </w:r>
-      <w:r>
-        <w:rPr>
-          <w:lang w:val="es-ES"/>
-        </w:rPr>
-        <w:t xml:space="preserve"> el manejo del entorno ESP-IDF</w:t>
-      </w:r>
-      <w:r>
-        <w:rPr>
-          <w:lang w:val="es-ES"/>
-        </w:rPr>
-        <w:t>.</w:t>
-      </w:r>
-      <w:r>
-        <w:rPr>
-          <w:lang w:val="es-ES"/>
-        </w:rPr>
-        <w:t xml:space="preserve"> </w:t>
-      </w:r>
     </w:p>
     <w:p>
       <w:pPr>
@@ -3802,59 +3122,7 @@
           <w:lang w:val="es-ES"/>
         </w:rPr>
       </w:pPr>
-    </w:p>
-    <w:p>
-      <w:pPr>
-        <w:pStyle w:val="Ttulo1"/>
-        <w:rPr>
-          <w:lang w:val="es-ES"/>
-        </w:rPr>
-      </w:pPr>
-      <w:bookmarkStart w:id="9" w:name="_Toc228499826"/>
-      <w:r>
-        <w:rPr>
-          <w:lang w:val="es-ES"/>
-        </w:rPr>
-        <w:t>7. Anexos</w:t>
-      </w:r>
-      <w:bookmarkEnd w:id="9"/>
-    </w:p>
-    <w:p>
-      <w:pPr>
-        <w:jc w:val="both"/>
-        <w:rPr>
-          <w:lang w:val="es-ES"/>
-        </w:rPr>
-      </w:pPr>
-      <w:r>
-        <w:rPr>
-          <w:lang w:val="es-ES"/>
-        </w:rPr>
-        <w:t xml:space="preserve">Enlace al repositorio del proyecto en </w:t>
-      </w:r>
-      <w:proofErr w:type="spellStart"/>
-      <w:r>
-        <w:rPr>
-          <w:lang w:val="es-ES"/>
-        </w:rPr>
-        <w:t>github</w:t>
-      </w:r>
-      <w:proofErr w:type="spellEnd"/>
-      <w:r>
-        <w:rPr>
-          <w:lang w:val="es-ES"/>
-        </w:rPr>
-        <w:t>:</w:t>
-      </w:r>
-    </w:p>
-    <w:p>
-      <w:pPr>
-        <w:jc w:val="both"/>
-        <w:rPr>
-          <w:lang w:val="es-ES"/>
-        </w:rPr>
-      </w:pPr>
-      <w:hyperlink r:id="rId17" w:history="1">
+      <w:hyperlink r:id="rId16" w:history="1">
         <w:r>
           <w:rPr>
             <w:rStyle w:val="Hipervnculo"/>
@@ -3873,7 +3141,7 @@
       </w:pPr>
     </w:p>
     <w:sectPr>
-      <w:footerReference w:type="default" r:id="rId18"/>
+      <w:footerReference w:type="default" r:id="rId17"/>
       <w:pgSz w:w="11906" w:h="16838"/>
       <w:pgMar w:top="1417" w:right="1701" w:bottom="1417" w:left="1701" w:header="708" w:footer="708" w:gutter="0"/>
       <w:cols w:space="708"/>
@@ -4971,6 +4239,7 @@
   <w:style w:type="character" w:default="1" w:styleId="Fuentedeprrafopredeter">
     <w:name w:val="Default Paragraph Font"/>
     <w:uiPriority w:val="1"/>
+    <w:semiHidden/>
     <w:unhideWhenUsed/>
   </w:style>
   <w:style w:type="table" w:default="1" w:styleId="Tablanormal">

</xml_diff>